<commit_message>
Changed TDD Documnet JSON Datasource
</commit_message>
<xml_diff>
--- a/Jasper_Report_TDD_6_Page.docx
+++ b/Jasper_Report_TDD_6_Page.docx
@@ -6,14 +6,23 @@
       <w:pPr>
         <w:pStyle w:val="Heading1"/>
       </w:pPr>
-      <w:bookmarkStart w:id="0" w:name="_GoBack"/>
-      <w:bookmarkEnd w:id="0"/>
       <w:r>
-        <w:t>Technical Design Document (TDD)</w:t>
+        <w:t>Technical Design Document (TDD</w:t>
+      </w:r>
+      <w:proofErr w:type="gramStart"/>
+      <w:r>
+        <w:t>)</w:t>
+      </w:r>
+      <w:r>
+        <w:t>---</w:t>
+      </w:r>
+      <w:proofErr w:type="gramEnd"/>
+      <w:r>
+        <w:t>Sample File</w:t>
       </w:r>
       <w:r>
         <w:br/>
-        <w:t>Employee Salary Jasper Report</w:t>
+        <w:t>JSON File.</w:t>
       </w:r>
     </w:p>
     <w:p>
@@ -26,12 +35,20 @@
     </w:p>
     <w:p>
       <w:r>
-        <w:t>Project Name: HR Reporting System</w:t>
+        <w:t>P</w:t>
+      </w:r>
+      <w:r>
+        <w:t>roject Name: Jasper Report File using JSON as data source</w:t>
       </w:r>
       <w:r>
         <w:br/>
-        <w:t>Report Name: Employee Salary Report</w:t>
+        <w:t>Rep</w:t>
       </w:r>
+      <w:r>
+        <w:t>ort Name: JSON Jasper report</w:t>
+      </w:r>
+      <w:bookmarkStart w:id="0" w:name="_GoBack"/>
+      <w:bookmarkEnd w:id="0"/>
       <w:r>
         <w:br/>
         <w:t>Version: 1.0</w:t>
@@ -50,18 +67,20 @@
       </w:r>
       <w:r>
         <w:br/>
-        <w:t xml:space="preserve">Output Formats: </w:t>
-      </w:r>
-      <w:r>
-        <w:t>PDF, XLSX, HTML</w:t>
+        <w:t>Output Formats: PDF, XLSX, HTML</w:t>
       </w:r>
       <w:r>
         <w:br/>
       </w:r>
       <w:r>
         <w:br/>
-        <w:t>Purpose:</w:t>
+        <w:t>Purpose</w:t>
       </w:r>
+      <w:proofErr w:type="gramStart"/>
+      <w:r>
+        <w:t>:</w:t>
+      </w:r>
+      <w:proofErr w:type="gramEnd"/>
       <w:r>
         <w:br/>
         <w:t>This document describes the technical design, implementation details, deployment strategy, and support considerations for the Employee Salary Report.</w:t>
@@ -77,10 +96,7 @@
     </w:p>
     <w:p>
       <w:r>
-        <w:t>The report provides salary information for employees across</w:t>
-      </w:r>
-      <w:r>
-        <w:t xml:space="preserve"> departments. HR and Finance teams use this report for payroll verification, auditing, and compliance reporting.</w:t>
+        <w:t>The report provides salary information for employees across departments. HR and Finance teams use this report for payroll verification, auditing, and compliance reporting.</w:t>
       </w:r>
       <w:r>
         <w:br/>
@@ -103,10 +119,7 @@
       </w:r>
       <w:r>
         <w:br/>
-        <w:t>• En</w:t>
-      </w:r>
-      <w:r>
-        <w:t>sure secure and performant report execution.</w:t>
+        <w:t>• Ensure secure and performant report execution.</w:t>
       </w:r>
     </w:p>
     <w:p>
@@ -146,10 +159,7 @@
       </w:r>
       <w:r>
         <w:br/>
-        <w:t>User → J</w:t>
-      </w:r>
-      <w:r>
-        <w:t>asper Server → JDBC Connection → Oracle Database → Jasper Engine → PDF/XLS Output</w:t>
+        <w:t>User → Jasper Server → JDBC Connection → Oracle Database → Jasper Engine → PDF/XLS Output</w:t>
       </w:r>
       <w:r>
         <w:br/>
@@ -201,10 +211,7 @@
       </w:r>
       <w:r>
         <w:br/>
-        <w:t>F</w:t>
-      </w:r>
-      <w:r>
-        <w:t>ields:</w:t>
+        <w:t>Fields:</w:t>
       </w:r>
       <w:r>
         <w:br/>
@@ -282,10 +289,7 @@
       </w:r>
       <w:r>
         <w:br/>
-        <w:t xml:space="preserve">       s.</w:t>
-      </w:r>
-      <w:r>
-        <w:t>deduction,</w:t>
+        <w:t xml:space="preserve">       s.deduction,</w:t>
       </w:r>
       <w:r>
         <w:br/>
@@ -334,10 +338,7 @@
       </w:r>
       <w:r>
         <w:br/>
-        <w:t>• Run D</w:t>
-      </w:r>
-      <w:r>
-        <w:t>ate</w:t>
+        <w:t>• Run Date</w:t>
       </w:r>
       <w:r>
         <w:br/>
@@ -406,10 +407,7 @@
       </w:r>
       <w:r>
         <w:br/>
-        <w:t>5. Test P</w:t>
-      </w:r>
-      <w:r>
-        <w:t>DF and Excel exports.</w:t>
+        <w:t>5. Test PDF and Excel exports.</w:t>
       </w:r>
     </w:p>
     <w:p>
@@ -453,10 +451,7 @@
       </w:r>
       <w:r>
         <w:br/>
-        <w:t>• Logging and monitori</w:t>
-      </w:r>
-      <w:r>
-        <w:t>ng.</w:t>
+        <w:t>• Logging and monitoring.</w:t>
       </w:r>
       <w:r>
         <w:br/>
@@ -490,10 +485,7 @@
       </w:r>
       <w:r>
         <w:br/>
-        <w:t>Production support team will monitor scheduled jobs, report execution logs, and perf</w:t>
-      </w:r>
-      <w:r>
-        <w:t>ormance metrics.</w:t>
+        <w:t>Production support team will monitor scheduled jobs, report execution logs, and performance metrics.</w:t>
       </w:r>
     </w:p>
     <w:sectPr>
@@ -12412,7 +12404,7 @@
 </file>
 
 <file path=customXml/itemProps1.xml><?xml version="1.0" encoding="utf-8"?>
-<ds:datastoreItem xmlns:ds="http://schemas.openxmlformats.org/officeDocument/2006/customXml" ds:itemID="{E7B3C247-A034-4725-A9F3-224897B2EEB0}">
+<ds:datastoreItem xmlns:ds="http://schemas.openxmlformats.org/officeDocument/2006/customXml" ds:itemID="{EDB0CA18-FFB8-4A04-BA64-728B0C0A01C9}">
   <ds:schemaRefs>
     <ds:schemaRef ds:uri="http://schemas.openxmlformats.org/officeDocument/2006/bibliography"/>
   </ds:schemaRefs>

</xml_diff>